<commit_message>
Bai tap cuoi ky: them phan cong 2 thanh vien va ban PDF
- Phan cong 50/50: Nguyen Quoc Cuong (phan tich bai toan, slide),
  Tran Nhu Duc (code thuat toan, bao cao); members.py dung chung, gen_phancong.py
- Them PDF cho slide va bang phan cong; xuat lai PDF bao cao
- Sua robust_dedup.py doc du lieu goc tu data/ (truoc do doc ban da loai trung,
  lam Bang 5 va bieu do ban ghi trung sai); sua chu chong o slide 6
</commit_message>
<xml_diff>
--- a/bai-tap-cuoi-ky/BaoCao_NhanDangMau.docx
+++ b/bai-tap-cuoi-ky/BaoCao_NhanDangMau.docx
@@ -92,10 +92,34 @@
       </w:pPr>
       <w:r>
         <w:rPr>
+          <w:b/>
+          <w:i w:val="0"/>
+        </w:rPr>
+        <w:t>Nhóm thực hiện:</w:t>
+      </w:r>
+    </w:p>
+    <w:p>
+      <w:pPr>
+        <w:jc w:val="center"/>
+      </w:pPr>
+      <w:r>
+        <w:rPr>
           <w:b w:val="0"/>
           <w:i w:val="0"/>
         </w:rPr>
-        <w:t>Nhóm thực hiện: Nhóm ..... (danh sách thành viên ở Mục 9)</w:t>
+        <w:t>Nguyễn Quốc Cường – B26CHKH013</w:t>
+      </w:r>
+    </w:p>
+    <w:p>
+      <w:pPr>
+        <w:jc w:val="center"/>
+      </w:pPr>
+      <w:r>
+        <w:rPr>
+          <w:b w:val="0"/>
+          <w:i w:val="0"/>
+        </w:rPr>
+        <w:t>Trần Như Đức – ....................</w:t>
       </w:r>
     </w:p>
     <w:p>
@@ -4687,7 +4711,7 @@
               <w:rPr>
                 <w:sz w:val="20"/>
               </w:rPr>
-              <w:t>0,277</w:t>
+              <w:t>0,408</w:t>
             </w:r>
           </w:p>
         </w:tc>
@@ -4704,7 +4728,7 @@
               <w:rPr>
                 <w:sz w:val="20"/>
               </w:rPr>
-              <w:t>0,692</w:t>
+              <w:t>0,758</w:t>
             </w:r>
           </w:p>
         </w:tc>
@@ -4721,7 +4745,7 @@
               <w:rPr>
                 <w:sz w:val="20"/>
               </w:rPr>
-              <w:t>0,210</w:t>
+              <w:t>0,344</w:t>
             </w:r>
           </w:p>
         </w:tc>
@@ -4774,7 +4798,7 @@
               <w:rPr>
                 <w:sz w:val="20"/>
               </w:rPr>
-              <w:t>0,539</w:t>
+              <w:t>0,586</w:t>
             </w:r>
           </w:p>
         </w:tc>
@@ -4791,7 +4815,7 @@
               <w:rPr>
                 <w:sz w:val="20"/>
               </w:rPr>
-              <w:t>0,837</w:t>
+              <w:t>0,865</w:t>
             </w:r>
           </w:p>
         </w:tc>
@@ -4808,7 +4832,7 @@
               <w:rPr>
                 <w:sz w:val="20"/>
               </w:rPr>
-              <w:t>0,781</w:t>
+              <w:t>0,824</w:t>
             </w:r>
           </w:p>
         </w:tc>
@@ -4861,7 +4885,7 @@
               <w:rPr>
                 <w:sz w:val="20"/>
               </w:rPr>
-              <w:t>0,450</w:t>
+              <w:t>0,665</w:t>
             </w:r>
           </w:p>
         </w:tc>
@@ -4878,7 +4902,7 @@
               <w:rPr>
                 <w:sz w:val="20"/>
               </w:rPr>
-              <w:t>0,860</w:t>
+              <w:t>0,925</w:t>
             </w:r>
           </w:p>
         </w:tc>
@@ -4895,7 +4919,7 @@
               <w:rPr>
                 <w:sz w:val="20"/>
               </w:rPr>
-              <w:t>0,339</w:t>
+              <w:t>0,560</w:t>
             </w:r>
           </w:p>
         </w:tc>
@@ -4948,7 +4972,7 @@
               <w:rPr>
                 <w:sz w:val="20"/>
               </w:rPr>
-              <w:t>0,494</w:t>
+              <w:t>0,676</w:t>
             </w:r>
           </w:p>
         </w:tc>
@@ -4965,7 +4989,7 @@
               <w:rPr>
                 <w:sz w:val="20"/>
               </w:rPr>
-              <w:t>0,851</w:t>
+              <w:t>0,913</w:t>
             </w:r>
           </w:p>
         </w:tc>
@@ -4982,7 +5006,7 @@
               <w:rPr>
                 <w:sz w:val="20"/>
               </w:rPr>
-              <w:t>0,418</w:t>
+              <w:t>0,607</w:t>
             </w:r>
           </w:p>
         </w:tc>
@@ -5355,7 +5379,7 @@
           <w:b w:val="0"/>
           <w:i w:val="0"/>
         </w:rPr>
-        <w:t>Với dữ liệu còn trùng, Random Forest đạt F1 0,450 và Gradient Boosting 0,494, có vẻ vượt xa SVM (0,539). Sau khi loại trùng, F1 của chúng rơi xuống 0,450 và 0,494, trong khi SVM chỉ giảm nhẹ (0,539). Nguyên nhân: mô hình cây có thể 'nhớ' chính xác mẫu huấn luyện, nên khi bản sao nằm ở tập kiểm tra chúng được chấm đúng gần như chắc chắn. Đây là lỗi phương pháp thường gặp với bộ dữ liệu này; nhiều kết quả công bố trên Wine Quality không loại trùng nên có thể lạc quan.</w:t>
+        <w:t>Với dữ liệu còn trùng, Random Forest đạt F1 0,665 và Gradient Boosting 0,676, có vẻ vượt xa SVM (0,586). Sau khi loại trùng, F1 của chúng rơi xuống 0,450 và 0,494, trong khi SVM chỉ giảm nhẹ (0,539). Nguyên nhân: mô hình cây có thể 'nhớ' chính xác mẫu huấn luyện, nên khi bản sao nằm ở tập kiểm tra chúng được chấm đúng gần như chắc chắn. Đây là lỗi phương pháp thường gặp với bộ dữ liệu này; nhiều kết quả công bố trên Wine Quality không loại trùng nên có thể lạc quan.</w:t>
       </w:r>
     </w:p>
     <w:p>
@@ -5923,15 +5947,6 @@
         <w:t>9. Phân công và tự đánh giá đóng góp</w:t>
       </w:r>
     </w:p>
-    <w:p>
-      <w:r>
-        <w:rPr>
-          <w:b w:val="0"/>
-          <w:i/>
-        </w:rPr>
-        <w:t>(Nhóm điền họ tên, MSSV và điều chỉnh tỉ lệ theo thực tế; tổng = 100%.)</w:t>
-      </w:r>
-    </w:p>
     <w:tbl>
       <w:tblPr>
         <w:tblStyle w:val="TableGrid"/>
@@ -6059,7 +6074,9 @@
               <w:rPr>
                 <w:sz w:val="20"/>
               </w:rPr>
-              <w:t>....................</w:t>
+              <w:t>Nguyễn Quốc Cường</w:t>
+              <w:br/>
+              <w:t>B26CHKH013</w:t>
             </w:r>
           </w:p>
         </w:tc>
@@ -6076,7 +6093,7 @@
               <w:rPr>
                 <w:sz w:val="20"/>
               </w:rPr>
-              <w:t>Nhóm trưởng; thu thập, khảo sát dữ liệu (EDA), phát hiện bản ghi trùng</w:t>
+              <w:t>Phân tích bài toán: chọn đề tài và dữ liệu, xác định mục tiêu, thước đo đánh giá; làm slide thuyết trình</w:t>
             </w:r>
           </w:p>
         </w:tc>
@@ -6093,7 +6110,7 @@
               <w:rPr>
                 <w:sz w:val="20"/>
               </w:rPr>
-              <w:t>25%</w:t>
+              <w:t>50%</w:t>
             </w:r>
           </w:p>
         </w:tc>
@@ -6146,6 +6163,8 @@
               <w:rPr>
                 <w:sz w:val="20"/>
               </w:rPr>
+              <w:t>Trần Như Đức</w:t>
+              <w:br/>
               <w:t>....................</w:t>
             </w:r>
           </w:p>
@@ -6163,7 +6182,7 @@
               <w:rPr>
                 <w:sz w:val="20"/>
               </w:rPr>
-              <w:t>Cài đặt phương án cơ sở, tiền xử lý, quy trình kiểm định chéo</w:t>
+              <w:t>Cài đặt code thuật toán: tiền xử lý, phương án cơ sở và cải tiến, kiểm định chéo, demo; viết báo cáo .docx</w:t>
             </w:r>
           </w:p>
         </w:tc>
@@ -6180,181 +6199,7 @@
               <w:rPr>
                 <w:sz w:val="20"/>
               </w:rPr>
-              <w:t>25%</w:t>
-            </w:r>
-          </w:p>
-        </w:tc>
-        <w:tc>
-          <w:tcPr>
-            <w:tcW w:type="dxa" w:w="1304"/>
-          </w:tcPr>
-          <w:p>
-            <w:pPr>
-              <w:spacing w:after="0"/>
-            </w:pPr>
-            <w:r/>
-            <w:r>
-              <w:rPr>
-                <w:sz w:val="20"/>
-              </w:rPr>
-              <w:t>....</w:t>
-            </w:r>
-          </w:p>
-        </w:tc>
-      </w:tr>
-      <w:tr>
-        <w:tc>
-          <w:tcPr>
-            <w:tcW w:type="dxa" w:w="567"/>
-          </w:tcPr>
-          <w:p>
-            <w:pPr>
-              <w:spacing w:after="0"/>
-            </w:pPr>
-            <w:r/>
-            <w:r>
-              <w:rPr>
-                <w:sz w:val="20"/>
-              </w:rPr>
-              <w:t>3</w:t>
-            </w:r>
-          </w:p>
-        </w:tc>
-        <w:tc>
-          <w:tcPr>
-            <w:tcW w:type="dxa" w:w="1984"/>
-          </w:tcPr>
-          <w:p>
-            <w:pPr>
-              <w:spacing w:after="0"/>
-            </w:pPr>
-            <w:r/>
-            <w:r>
-              <w:rPr>
-                <w:sz w:val="20"/>
-              </w:rPr>
-              <w:t>....................</w:t>
-            </w:r>
-          </w:p>
-        </w:tc>
-        <w:tc>
-          <w:tcPr>
-            <w:tcW w:type="dxa" w:w="4082"/>
-          </w:tcPr>
-          <w:p>
-            <w:pPr>
-              <w:spacing w:after="0"/>
-            </w:pPr>
-            <w:r/>
-            <w:r>
-              <w:rPr>
-                <w:sz w:val="20"/>
-              </w:rPr>
-              <w:t>Cải tiến mô hình (SVM, cân bằng lớp, ngưỡng), kiểm định thống kê, phân tích lỗi</w:t>
-            </w:r>
-          </w:p>
-        </w:tc>
-        <w:tc>
-          <w:tcPr>
-            <w:tcW w:type="dxa" w:w="1134"/>
-          </w:tcPr>
-          <w:p>
-            <w:pPr>
-              <w:spacing w:after="0"/>
-            </w:pPr>
-            <w:r/>
-            <w:r>
-              <w:rPr>
-                <w:sz w:val="20"/>
-              </w:rPr>
-              <w:t>25%</w:t>
-            </w:r>
-          </w:p>
-        </w:tc>
-        <w:tc>
-          <w:tcPr>
-            <w:tcW w:type="dxa" w:w="1304"/>
-          </w:tcPr>
-          <w:p>
-            <w:pPr>
-              <w:spacing w:after="0"/>
-            </w:pPr>
-            <w:r/>
-            <w:r>
-              <w:rPr>
-                <w:sz w:val="20"/>
-              </w:rPr>
-              <w:t>....</w:t>
-            </w:r>
-          </w:p>
-        </w:tc>
-      </w:tr>
-      <w:tr>
-        <w:tc>
-          <w:tcPr>
-            <w:tcW w:type="dxa" w:w="567"/>
-          </w:tcPr>
-          <w:p>
-            <w:pPr>
-              <w:spacing w:after="0"/>
-            </w:pPr>
-            <w:r/>
-            <w:r>
-              <w:rPr>
-                <w:sz w:val="20"/>
-              </w:rPr>
-              <w:t>4</w:t>
-            </w:r>
-          </w:p>
-        </w:tc>
-        <w:tc>
-          <w:tcPr>
-            <w:tcW w:type="dxa" w:w="1984"/>
-          </w:tcPr>
-          <w:p>
-            <w:pPr>
-              <w:spacing w:after="0"/>
-            </w:pPr>
-            <w:r/>
-            <w:r>
-              <w:rPr>
-                <w:sz w:val="20"/>
-              </w:rPr>
-              <w:t>....................</w:t>
-            </w:r>
-          </w:p>
-        </w:tc>
-        <w:tc>
-          <w:tcPr>
-            <w:tcW w:type="dxa" w:w="4082"/>
-          </w:tcPr>
-          <w:p>
-            <w:pPr>
-              <w:spacing w:after="0"/>
-            </w:pPr>
-            <w:r/>
-            <w:r>
-              <w:rPr>
-                <w:sz w:val="20"/>
-              </w:rPr>
-              <w:t>Demo Streamlit, báo cáo, slide và thuyết trình</w:t>
-            </w:r>
-          </w:p>
-        </w:tc>
-        <w:tc>
-          <w:tcPr>
-            <w:tcW w:type="dxa" w:w="1134"/>
-          </w:tcPr>
-          <w:p>
-            <w:pPr>
-              <w:spacing w:after="0"/>
-            </w:pPr>
-            <w:r/>
-            <w:r>
-              <w:rPr>
-                <w:sz w:val="20"/>
-              </w:rPr>
-              <w:t>25%</w:t>
+              <w:t>50%</w:t>
             </w:r>
           </w:p>
         </w:tc>
@@ -6377,6 +6222,15 @@
         </w:tc>
       </w:tr>
     </w:tbl>
+    <w:p>
+      <w:r>
+        <w:rPr>
+          <w:b w:val="0"/>
+          <w:i/>
+        </w:rPr>
+        <w:t>Tổng đóng góp: 100%. Hai thành viên cùng thảo luận chọn phương án và thống nhất kết luận.</w:t>
+      </w:r>
+    </w:p>
     <w:p>
       <w:pPr>
         <w:pStyle w:val="Heading1"/>

</xml_diff>

<commit_message>
Bai tap cuoi ky: thong tin hoc vien/GVHD, minh hoa dong bien phan lop
- Bia bao cao, slide, bang phan cong: Hoc vien Cong nghe Buu chinh Vien thong,
  GVHD Nguyen Xuan Duc, MSSV Tran Nhu Duc B26CHKH027; bo dong Khoa
- Bang phan cong: bo phan ky ten; xuat lai PDF
- gen_viz.py: bien quyet dinh 6 mo hinh tren do con va axit bay hoi,
  sinh figures/phan_lop_dong.gif va trang tuong tac viz/PhanLop_Dong.html
- README: them anh GIF va mo ta
</commit_message>
<xml_diff>
--- a/bai-tap-cuoi-ky/BaoCao_NhanDangMau.docx
+++ b/bai-tap-cuoi-ky/BaoCao_NhanDangMau.docx
@@ -11,19 +11,7 @@
           <w:b/>
           <w:i w:val="0"/>
         </w:rPr>
-        <w:t>TRƯỜNG ........................................</w:t>
-      </w:r>
-    </w:p>
-    <w:p>
-      <w:pPr>
-        <w:jc w:val="center"/>
-      </w:pPr>
-      <w:r>
-        <w:rPr>
-          <w:b/>
-          <w:i w:val="0"/>
-        </w:rPr>
-        <w:t>KHOA ........................................</w:t>
+        <w:t>HỌC VIỆN CÔNG NGHỆ BƯU CHÍNH VIỄN THÔNG</w:t>
       </w:r>
     </w:p>
     <w:p/>
@@ -119,7 +107,7 @@
           <w:b w:val="0"/>
           <w:i w:val="0"/>
         </w:rPr>
-        <w:t>Trần Như Đức – ....................</w:t>
+        <w:t>Trần Như Đức – B26CHKH027</w:t>
       </w:r>
     </w:p>
     <w:p>
@@ -131,7 +119,7 @@
           <w:b w:val="0"/>
           <w:i w:val="0"/>
         </w:rPr>
-        <w:t>Giảng viên hướng dẫn: ........................................</w:t>
+        <w:t>Giảng viên hướng dẫn: Nguyễn Xuân Đức</w:t>
       </w:r>
     </w:p>
     <w:p>
@@ -6165,7 +6153,7 @@
               </w:rPr>
               <w:t>Trần Như Đức</w:t>
               <w:br/>
-              <w:t>....................</w:t>
+              <w:t>B26CHKH027</w:t>
             </w:r>
           </w:p>
         </w:tc>

</xml_diff>